<commit_message>
Gestrav: add Mission Urgence Eau Guadeloupe 2020 context and role
Gestrav was built for the 2020 "Urgence Eau Guadeloupe" mission
(prefectoral requisitions given to Karukér'Ô / SUEZ): a team of 3 at
DIGITOM built a tool coordinating leak detectors, repairers and the
network manager (SIAEAG), plus the Power BI data published on the
public urgence-eau-guadeloupe.org site. Yoel worked on parts of the UI
and on the geolocation / map. CV docx and PDF updated to match.

Co-Authored-By: Claude Opus 5.5 <noreply@anthropic.com>
Claude-Session: https://claude.ai/code/session_01MMJHxWKT7hbZHRqtCKGEkq
</commit_message>
<xml_diff>
--- a/public/cv/CV_Yoel_PEPIN.docx
+++ b/public/cv/CV_Yoel_PEPIN.docx
@@ -7711,7 +7711,7 @@
               <w:pStyle w:val="ProjetTitle"/>
             </w:pPr>
             <w:r>
-              <w:t xml:space="preserve">Gestrav, Projet gouvernemental de coordination de réparation de fuites d'eau – 5 mois – Juin 2020 à octobre 2020</w:t>
+              <w:t xml:space="preserve">Gestrav, Mission Urgence Eau Guadeloupe 2020 : coordination de réparation de fuites d'eau – 5 mois – Juin 2020 à octobre 2020</w:t>
             </w:r>
           </w:p>
           <w:p>
@@ -7750,7 +7750,7 @@
               <w:pStyle w:val="ProjetDesc"/>
             </w:pPr>
             <w:r>
-              <w:t>Mise en œuvre d'un projet régional pour coordonner les acteurs de la réparation des fuites d'eau :</w:t>
+              <w:t>Mission « Urgence Eau Guadeloupe » 2020 : face aux pénuries d'eau, l'État a ordonné des réquisitions préfectorales confiées au groupement Karukér'Ô / SUEZ. Au sein d'une équipe de 3 personnes, élaboration d'un outil de gestion coordonnant les détecteurs de fuites, les réparateurs et le gestionnaire du réseau (SIAEAG) :</w:t>
             </w:r>
           </w:p>
           <w:p>
@@ -7767,6 +7767,14 @@
             </w:pPr>
             <w:r>
               <w:t>Développement en C#, ASP.NET, Javascript et intégration de Power BI.</w:t>
+            </w:r>
+          </w:p>
+          <w:p>
+            <w:pPr>
+              <w:pStyle w:val="ProjetDesc"/>
+            </w:pPr>
+            <w:r>
+              <w:t xml:space="preserve">Données et rapports Power BI des indicateurs de la mission (fuites détectées et réparées), suivis en temps réel par les usagers sur le site public urgence-eau-guadeloupe.org.</w:t>
             </w:r>
           </w:p>
           <w:p>
@@ -7816,6 +7824,22 @@
             </w:pPr>
             <w:r>
               <w:t>POC Power BI de la géolocalisation</w:t>
+            </w:r>
+          </w:p>
+          <w:p>
+            <w:pPr>
+              <w:pStyle w:val="ProjetDesc"/>
+            </w:pPr>
+            <w:r>
+              <w:t xml:space="preserve">Données et rapports Power BI des indicateurs publiés sur urgence-eau-guadeloupe.org</w:t>
+            </w:r>
+          </w:p>
+          <w:p>
+            <w:pPr>
+              <w:pStyle w:val="ProjetDesc"/>
+            </w:pPr>
+            <w:r>
+              <w:t xml:space="preserve">Développement d'une partie de l'interface utilisateur de Gestrav</w:t>
             </w:r>
           </w:p>
           <w:p>

</xml_diff>

<commit_message>
Interactive demos of real projects, WONDO and HellBoy in the CV
- /demos/: the real front ends of ARC GR, Matheva, HellBoy, Aivocat and
  WONDO (Expo web export), built untouched from the sibling repos with an
  in-browser fake API and fictitious data (demos/build.mjs, npm run demos)
- Floating demo banner with quick sign-in per role and reset
- nginx: per-demo SPA fallback, noindex; robots.txt disallows /demos/
- "Try the demo" buttons on the featured projects, new HellBoy and WONDO cards
- CV: WONDO (ICEKERA) and DREVIO Phase 2 - HellBoy missions, FR/EN site,
  Word and PDF
- .gitattributes: binaries never get line-ending conversion

Co-Authored-By: Claude Opus 5.5 <noreply@anthropic.com>
</commit_message>
<xml_diff>
--- a/public/cv/CV_Yoel_PEPIN.docx
+++ b/public/cv/CV_Yoel_PEPIN.docx
@@ -2455,7 +2455,7 @@
                 <w:sz w:val="22"/>
                 <w:szCs w:val="22"/>
               </w:rPr>
-              <w:t xml:space="preserve">ARC Gestion et Recouvrement - Site vitrine, CRM et portail client</w:t>
+              <w:t xml:space="preserve">WONDO - Application mobile de gestion de clubs d'arts martiaux</w:t>
             </w:r>
             <w:r>
               <w:rPr>
@@ -2463,7 +2463,7 @@
                 <w:sz w:val="22"/>
                 <w:szCs w:val="22"/>
               </w:rPr>
-              <w:t xml:space="preserve"> (08/2026 à 09/2026) :</w:t>
+              <w:t xml:space="preserve"> (08/2026 à aujourd'hui) :</w:t>
             </w:r>
           </w:p>
           <w:p>
@@ -2487,7 +2487,7 @@
                 <w:szCs w:val="20"/>
                 <w:lang w:eastAsia="fr-FR"/>
               </w:rPr>
-              <w:t xml:space="preserve">Plateforme complète pour un cabinet de recouvrement de créances : site vitrine (arc-gr.fr), mini-CRM interne de suivi des dossiers de relance et portail client privé pour suivre les montants recouvrés.</w:t>
+              <w:t xml:space="preserve">Application iOS / Android destinée aux clubs d'arts martiaux de Guadeloupe : chaque adhérent y retrouve son planning, sa progression et son abonnement, l'encadrement gère le club depuis son téléphone ou depuis un back-office web. Premier club équipé : Song Long.</w:t>
             </w:r>
           </w:p>
           <w:p>
@@ -2498,7 +2498,7 @@
               <w:t>➢</w:t>
             </w:r>
             <w:r>
-              <w:t xml:space="preserve"> Site vitrine avec calculateur d'impact des impayés, SEO et pages légales.</w:t>
+              <w:t xml:space="preserve"> Application Expo / React Native à trois espaces (élève, instructeur, admin) avec garde de rôle, et sélecteur de vue et de club pour l'administrateur de la plateforme.</w:t>
             </w:r>
             <w:r>
               <w:br/>
@@ -2514,10 +2514,10 @@
                 <w:b/>
                 <w:bCs/>
               </w:rPr>
-              <w:t xml:space="preserve"> Mini-CRM</w:t>
-            </w:r>
-            <w:r>
-              <w:t xml:space="preserve"> : clients, dossiers de créances, statuts en kanban, historique des relances, alertes d'échéances et recherche / tri.</w:t>
+              <w:t xml:space="preserve"> Élève</w:t>
+            </w:r>
+            <w:r>
+              <w:t xml:space="preserve"> : planning et réservations, abonnement et formules, progression par discipline (niveaux, techniques), actualités du club.</w:t>
             </w:r>
             <w:r>
               <w:br/>
@@ -2529,7 +2529,14 @@
               <w:t>➢</w:t>
             </w:r>
             <w:r>
-              <w:t xml:space="preserve"> Relance par mail en deux temps, envoi groupé multi-clients, verrou anti-double envoi.</w:t>
+              <w:rPr>
+                <w:b/>
+                <w:bCs/>
+              </w:rPr>
+              <w:t xml:space="preserve"> Instructeur</w:t>
+            </w:r>
+            <w:r>
+              <w:t xml:space="preserve"> : feuille d'appel à quatre statuts (semaine, jour puis cours), recherche d'élèves et fiche élève complète.</w:t>
             </w:r>
             <w:r>
               <w:br/>
@@ -2545,10 +2552,10 @@
                 <w:b/>
                 <w:bCs/>
               </w:rPr>
-              <w:t xml:space="preserve"> Import Excel / CSV des fichiers clients</w:t>
-            </w:r>
-            <w:r>
-              <w:t xml:space="preserve"> : aperçu avant import, correspondance des colonnes mémorisée par client, réconciliation et annulation complète d'un import.</w:t>
+              <w:t xml:space="preserve"> Admin</w:t>
+            </w:r>
+            <w:r>
+              <w:t xml:space="preserve"> : membres et rôles, cours récurrents (modifier une série ne touche que les séances à venir), encaissement des paiements depuis le téléphone, statistiques.</w:t>
             </w:r>
             <w:r>
               <w:br/>
@@ -2560,7 +2567,7 @@
               <w:t>➢</w:t>
             </w:r>
             <w:r>
-              <w:t xml:space="preserve"> Compte rendu client en Word (.docx) avec part due sur les montants recouvrés et commentaire généré par IA (API Claude).</w:t>
+              <w:t xml:space="preserve"> Inscription en ligne sur le modèle du formulaire du club (photo par caméra ou fichier, e-mail récapitulatif, export Excel) ; la validation envoie l'accès à l'élève et active son abonnement.</w:t>
             </w:r>
             <w:r>
               <w:br/>
@@ -2576,10 +2583,10 @@
                 <w:b/>
                 <w:bCs/>
               </w:rPr>
-              <w:t xml:space="preserve"> Portail client privé</w:t>
-            </w:r>
-            <w:r>
-              <w:t xml:space="preserve"> : authentification par rôle (JWT), accès ouverts depuis le CRM, consultation des montants en cours et recouvrés.</w:t>
+              <w:t xml:space="preserve"> Back-office web générique</w:t>
+            </w:r>
+            <w:r>
+              <w:t xml:space="preserve"> : tableaux et formulaires générés à partir d'un registre de ressources déclaré côté API, cloisonnement des données par club.</w:t>
             </w:r>
             <w:r>
               <w:br/>
@@ -2591,7 +2598,14 @@
               <w:t>➢</w:t>
             </w:r>
             <w:r>
-              <w:t xml:space="preserve"> PostgreSQL sur réseau Docker interne, migrations Alembic jouées à chaque déploiement, corbeille (soft-delete) et sauvegarde automatique.</w:t>
+              <w:rPr>
+                <w:b/>
+                <w:bCs/>
+              </w:rPr>
+              <w:t xml:space="preserve"> API FastAPI / PostgreSQL</w:t>
+            </w:r>
+            <w:r>
+              <w:t xml:space="preserve"> : adhésions calées sur l'année scolaire, fuseau horaire de la Guadeloupe, suppression du compte et des données personnelles depuis l'application.</w:t>
             </w:r>
             <w:r>
               <w:br/>
@@ -2603,7 +2617,14 @@
               <w:t>➢</w:t>
             </w:r>
             <w:r>
-              <w:t xml:space="preserve"> VPS durci (SSH par clé, pare-feu, fail2ban) et reverse proxy Traefik partagé avec TLS Let's Encrypt.</w:t>
+              <w:rPr>
+                <w:b/>
+                <w:bCs/>
+              </w:rPr>
+              <w:t xml:space="preserve"> Publication</w:t>
+            </w:r>
+            <w:r>
+              <w:t xml:space="preserve"> : builds EAS (TestFlight, APK et Google Play), mises à jour OTA, fiche App Store en cours de soumission ; déploiement Docker / Traefik par GitHub Actions.</w:t>
             </w:r>
           </w:p>
           <w:p>
@@ -2621,7 +2642,7 @@
               <w:t xml:space="preserve"> Environnement technique :</w:t>
             </w:r>
             <w:r>
-              <w:t xml:space="preserve"> React, TypeScript, Vite, Tailwind, React Hook Form, Zod, FastAPI, SQLAlchemy, Alembic, python-docx, PostgreSQL, API Claude (Anthropic), Docker, Traefik, GitHub Actions, VPS Linux.</w:t>
+              <w:t xml:space="preserve"> React Native 0.81, Expo SDK 54 (Expo Router, EAS Build, EAS Update), TypeScript, TanStack Query, Zustand, React Hook Form + Zod ; back-office React, Vite, Tailwind, FastAPI, SQLAlchemy, Alembic, PostgreSQL, Docker, Traefik, GitHub Actions.</w:t>
             </w:r>
           </w:p>
           <w:p/>
@@ -2646,7 +2667,7 @@
                 <w:sz w:val="22"/>
                 <w:szCs w:val="22"/>
               </w:rPr>
-              <w:t xml:space="preserve">Matheva - Plateforme de cours particuliers de mathématiques</w:t>
+              <w:t xml:space="preserve">ARC Gestion et Recouvrement - Site vitrine, CRM et portail client</w:t>
             </w:r>
             <w:r>
               <w:rPr>
@@ -2678,7 +2699,7 @@
                 <w:szCs w:val="20"/>
                 <w:lang w:eastAsia="fr-FR"/>
               </w:rPr>
-              <w:t xml:space="preserve">Plateforme en 3 volets pour une professeure de mathématiques (site public, espace parent, espace professeur), organisée autour d'un fil pédagogique : évaluer, identifier les besoins, accompagner, mesurer les progrès et informer les parents.</w:t>
+              <w:t xml:space="preserve">Plateforme complète pour un cabinet de recouvrement de créances : site vitrine (arc-gr.fr), mini-CRM interne de suivi des dossiers de relance et portail client privé pour suivre les montants recouvrés.</w:t>
             </w:r>
           </w:p>
           <w:p>
@@ -2689,7 +2710,7 @@
               <w:t>➢</w:t>
             </w:r>
             <w:r>
-              <w:t xml:space="preserve"> Site public avec formulaire de contact envoyé par e-mail (SMTP).</w:t>
+              <w:t xml:space="preserve"> Site vitrine avec calculateur d'impact des impayés, SEO et pages légales.</w:t>
             </w:r>
             <w:r>
               <w:br/>
@@ -2705,10 +2726,10 @@
                 <w:b/>
                 <w:bCs/>
               </w:rPr>
-              <w:t xml:space="preserve"> Test diagnostique public</w:t>
-            </w:r>
-            <w:r>
-              <w:t xml:space="preserve"> : banque de questions, scoring côté serveur, restitution par paliers et capture des leads (page « Élèves en attente »).</w:t>
+              <w:t xml:space="preserve"> Mini-CRM</w:t>
+            </w:r>
+            <w:r>
+              <w:t xml:space="preserve"> : clients, dossiers de créances, statuts en kanban, historique des relances, alertes d'échéances et recherche / tri.</w:t>
             </w:r>
             <w:r>
               <w:br/>
@@ -2720,14 +2741,7 @@
               <w:t>➢</w:t>
             </w:r>
             <w:r>
-              <w:rPr>
-                <w:b/>
-                <w:bCs/>
-              </w:rPr>
-              <w:t xml:space="preserve"> Espace professeur</w:t>
-            </w:r>
-            <w:r>
-              <w:t xml:space="preserve"> : élèves, calendrier et fiches de séance, suivi des notions par programme, types de cours et tarifs.</w:t>
+              <w:t xml:space="preserve"> Relance par mail en deux temps, envoi groupé multi-clients, verrou anti-double envoi.</w:t>
             </w:r>
             <w:r>
               <w:br/>
@@ -2743,10 +2757,10 @@
                 <w:b/>
                 <w:bCs/>
               </w:rPr>
-              <w:t xml:space="preserve"> Module paiements</w:t>
-            </w:r>
-            <w:r>
-              <w:t xml:space="preserve"> : un cours réalisé ou annulé génère automatiquement son paiement, KPI de revenu prévu.</w:t>
+              <w:t xml:space="preserve"> Import Excel / CSV des fichiers clients</w:t>
+            </w:r>
+            <w:r>
+              <w:t xml:space="preserve"> : aperçu avant import, correspondance des colonnes mémorisée par client, réconciliation et annulation complète d'un import.</w:t>
             </w:r>
             <w:r>
               <w:br/>
@@ -2758,14 +2772,7 @@
               <w:t>➢</w:t>
             </w:r>
             <w:r>
-              <w:rPr>
-                <w:b/>
-                <w:bCs/>
-              </w:rPr>
-              <w:t xml:space="preserve"> Espace parent en lecture seule</w:t>
-            </w:r>
-            <w:r>
-              <w:t xml:space="preserve"> : suivi des notions, séances, travail à faire et paiements de chaque enfant, accès par lien personnel sans mot de passe.</w:t>
+              <w:t xml:space="preserve"> Compte rendu client en Word (.docx) avec part due sur les montants recouvrés et commentaire généré par IA (API Claude).</w:t>
             </w:r>
             <w:r>
               <w:br/>
@@ -2777,10 +2784,18 @@
               <w:t>➢</w:t>
             </w:r>
             <w:r>
-              <w:t xml:space="preserve"> Export du planning vers Google Calendar (flux iCal).</w:t>
-            </w:r>
-          </w:p>
-          <w:p>
+              <w:rPr>
+                <w:b/>
+                <w:bCs/>
+              </w:rPr>
+              <w:t xml:space="preserve"> Portail client privé</w:t>
+            </w:r>
+            <w:r>
+              <w:t xml:space="preserve"> : authentification par rôle (JWT), accès ouverts depuis le CRM, consultation des montants en cours et recouvrés.</w:t>
+            </w:r>
+            <w:r>
+              <w:br/>
+            </w:r>
             <w:r>
               <w:rPr>
                 <w:rFonts w:ascii="Segoe UI Symbol" w:hAnsi="Segoe UI Symbol" w:cs="Segoe UI Symbol"/>
@@ -2788,6 +2803,29 @@
               <w:t>➢</w:t>
             </w:r>
             <w:r>
+              <w:t xml:space="preserve"> PostgreSQL sur réseau Docker interne, migrations Alembic jouées à chaque déploiement, corbeille (soft-delete) et sauvegarde automatique.</w:t>
+            </w:r>
+            <w:r>
+              <w:br/>
+            </w:r>
+            <w:r>
+              <w:rPr>
+                <w:rFonts w:ascii="Segoe UI Symbol" w:hAnsi="Segoe UI Symbol" w:cs="Segoe UI Symbol"/>
+              </w:rPr>
+              <w:t>➢</w:t>
+            </w:r>
+            <w:r>
+              <w:t xml:space="preserve"> VPS durci (SSH par clé, pare-feu, fail2ban) et reverse proxy Traefik partagé avec TLS Let's Encrypt.</w:t>
+            </w:r>
+          </w:p>
+          <w:p>
+            <w:r>
+              <w:rPr>
+                <w:rFonts w:ascii="Segoe UI Symbol" w:hAnsi="Segoe UI Symbol" w:cs="Segoe UI Symbol"/>
+              </w:rPr>
+              <w:t>➢</w:t>
+            </w:r>
+            <w:r>
               <w:rPr>
                 <w:b/>
                 <w:bCs/>
@@ -2795,7 +2833,7 @@
               <w:t xml:space="preserve"> Environnement technique :</w:t>
             </w:r>
             <w:r>
-              <w:t xml:space="preserve"> React, TypeScript, Vite, Tailwind, FastAPI, SQLAlchemy, icalendar, PostgreSQL, Docker, Traefik, GitHub Actions.</w:t>
+              <w:t xml:space="preserve"> React, TypeScript, Vite, Tailwind, React Hook Form, Zod, FastAPI, SQLAlchemy, Alembic, python-docx, PostgreSQL, API Claude (Anthropic), Docker, Traefik, GitHub Actions, VPS Linux.</w:t>
             </w:r>
           </w:p>
           <w:p/>
@@ -2820,7 +2858,7 @@
                 <w:sz w:val="22"/>
                 <w:szCs w:val="22"/>
               </w:rPr>
-              <w:t xml:space="preserve">Valado - Migration et sécurisation d'une infrastructure Sage Batigest</w:t>
+              <w:t xml:space="preserve">Matheva - Plateforme de cours particuliers de mathématiques</w:t>
             </w:r>
             <w:r>
               <w:rPr>
@@ -2828,7 +2866,7 @@
                 <w:sz w:val="22"/>
                 <w:szCs w:val="22"/>
               </w:rPr>
-              <w:t xml:space="preserve"> (08/2026) :</w:t>
+              <w:t xml:space="preserve"> (08/2026 à 09/2026) :</w:t>
             </w:r>
           </w:p>
           <w:p>
@@ -2852,7 +2890,7 @@
                 <w:szCs w:val="20"/>
                 <w:lang w:eastAsia="fr-FR"/>
               </w:rPr>
-              <w:t xml:space="preserve">Migration et remise à niveau d'une infrastructure Sage Batigest reposant sur SQL Server, avec transfert vers un nouveau serveur Windows et rétablissement des accès multi-postes.</w:t>
+              <w:t xml:space="preserve">Plateforme en 3 volets pour une professeure de mathématiques (site public, espace parent, espace professeur), organisée autour d'un fil pédagogique : évaluer, identifier les besoins, accompagner, mesurer les progrès et informer les parents.</w:t>
             </w:r>
           </w:p>
           <w:p>
@@ -2863,7 +2901,7 @@
               <w:t>➢</w:t>
             </w:r>
             <w:r>
-              <w:t xml:space="preserve"> Migration de Sage Batigest et de sa base SQL Server Express vers un nouveau serveur Windows, rétablissement des accès multi-postes.</w:t>
+              <w:t xml:space="preserve"> Site public avec formulaire de contact envoyé par e-mail (SMTP).</w:t>
             </w:r>
             <w:r>
               <w:br/>
@@ -2875,7 +2913,14 @@
               <w:t>➢</w:t>
             </w:r>
             <w:r>
-              <w:t xml:space="preserve"> Configuration de SQL Server, des services réseau et des règles de pare-feu nécessaires au fonctionnement de Batigest.</w:t>
+              <w:rPr>
+                <w:b/>
+                <w:bCs/>
+              </w:rPr>
+              <w:t xml:space="preserve"> Test diagnostique public</w:t>
+            </w:r>
+            <w:r>
+              <w:t xml:space="preserve"> : banque de questions, scoring côté serveur, restitution par paliers et capture des leads (page « Élèves en attente »).</w:t>
             </w:r>
             <w:r>
               <w:br/>
@@ -2887,7 +2932,14 @@
               <w:t>➢</w:t>
             </w:r>
             <w:r>
-              <w:t xml:space="preserve"> Administration distante sécurisée via Tailscale (WireGuard) et RDP, sans exposition du service RDP sur Internet, avec compte administrateur dédié et gestion des accès.</w:t>
+              <w:rPr>
+                <w:b/>
+                <w:bCs/>
+              </w:rPr>
+              <w:t xml:space="preserve"> Espace professeur</w:t>
+            </w:r>
+            <w:r>
+              <w:t xml:space="preserve"> : élèves, calendrier et fiches de séance, suivi des notions par programme, types de cours et tarifs.</w:t>
             </w:r>
             <w:r>
               <w:br/>
@@ -2899,7 +2951,14 @@
               <w:t>➢</w:t>
             </w:r>
             <w:r>
-              <w:t xml:space="preserve"> Déploiement de RustDesk avec accès sans surveillance pour la télémaintenance et le support utilisateur.</w:t>
+              <w:rPr>
+                <w:b/>
+                <w:bCs/>
+              </w:rPr>
+              <w:t xml:space="preserve"> Module paiements</w:t>
+            </w:r>
+            <w:r>
+              <w:t xml:space="preserve"> : un cours réalisé ou annulé génère automatiquement son paiement, KPI de revenu prévu.</w:t>
             </w:r>
             <w:r>
               <w:br/>
@@ -2915,13 +2974,14 @@
                 <w:b/>
                 <w:bCs/>
               </w:rPr>
-              <w:t xml:space="preserve"> Fiabilisation du serveur</w:t>
-            </w:r>
-            <w:r>
-              <w:t xml:space="preserve"> : démarrage automatique des services, gestion de l'alimentation, accès réseau et continuité de service.</w:t>
-            </w:r>
-          </w:p>
-          <w:p>
+              <w:t xml:space="preserve"> Espace parent en lecture seule</w:t>
+            </w:r>
+            <w:r>
+              <w:t xml:space="preserve"> : suivi des notions, séances, travail à faire et paiements de chaque enfant, accès par lien personnel sans mot de passe.</w:t>
+            </w:r>
+            <w:r>
+              <w:br/>
+            </w:r>
             <w:r>
               <w:rPr>
                 <w:rFonts w:ascii="Segoe UI Symbol" w:hAnsi="Segoe UI Symbol" w:cs="Segoe UI Symbol"/>
@@ -2929,6 +2989,17 @@
               <w:t>➢</w:t>
             </w:r>
             <w:r>
+              <w:t xml:space="preserve"> Export du planning vers Google Calendar (flux iCal).</w:t>
+            </w:r>
+          </w:p>
+          <w:p>
+            <w:r>
+              <w:rPr>
+                <w:rFonts w:ascii="Segoe UI Symbol" w:hAnsi="Segoe UI Symbol" w:cs="Segoe UI Symbol"/>
+              </w:rPr>
+              <w:t>➢</w:t>
+            </w:r>
+            <w:r>
               <w:rPr>
                 <w:b/>
                 <w:bCs/>
@@ -2936,7 +3007,7 @@
               <w:t xml:space="preserve"> Environnement technique :</w:t>
             </w:r>
             <w:r>
-              <w:t xml:space="preserve"> Windows Server, administration système, PowerShell, Sage Batigest, SQL Server Express, Tailscale (WireGuard), RDP, SMB, TCP/IP, pare-feu Windows, RustDesk.</w:t>
+              <w:t xml:space="preserve"> React, TypeScript, Vite, Tailwind, FastAPI, SQLAlchemy, icalendar, PostgreSQL, Docker, Traefik, GitHub Actions.</w:t>
             </w:r>
           </w:p>
           <w:p/>
@@ -2952,6 +3023,147 @@
                 <w:szCs w:val="22"/>
               </w:rPr>
               <w:t xml:space="preserve">5. </w:t>
+            </w:r>
+            <w:r>
+              <w:rPr>
+                <w:b/>
+                <w:bCs/>
+                <w:color w:val="000000"/>
+                <w:sz w:val="22"/>
+                <w:szCs w:val="22"/>
+              </w:rPr>
+              <w:t xml:space="preserve">Valado - Migration et sécurisation d'une infrastructure Sage Batigest</w:t>
+            </w:r>
+            <w:r>
+              <w:rPr>
+                <w:color w:val="000000"/>
+                <w:sz w:val="22"/>
+                <w:szCs w:val="22"/>
+              </w:rPr>
+              <w:t xml:space="preserve"> (08/2026) :</w:t>
+            </w:r>
+          </w:p>
+          <w:p>
+            <w:pPr>
+              <w:pStyle w:val="Corpsdetexte"/>
+              <w:rPr>
+                <w:i/>
+                <w:iCs/>
+                <w:color w:val="auto"/>
+                <w:sz w:val="20"/>
+                <w:szCs w:val="20"/>
+                <w:lang w:eastAsia="fr-FR"/>
+              </w:rPr>
+            </w:pPr>
+            <w:r>
+              <w:rPr>
+                <w:i/>
+                <w:iCs/>
+                <w:color w:val="auto"/>
+                <w:sz w:val="20"/>
+                <w:szCs w:val="20"/>
+                <w:lang w:eastAsia="fr-FR"/>
+              </w:rPr>
+              <w:t xml:space="preserve">Migration et remise à niveau d'une infrastructure Sage Batigest reposant sur SQL Server, avec transfert vers un nouveau serveur Windows et rétablissement des accès multi-postes.</w:t>
+            </w:r>
+          </w:p>
+          <w:p>
+            <w:r>
+              <w:rPr>
+                <w:rFonts w:ascii="Segoe UI Symbol" w:hAnsi="Segoe UI Symbol" w:cs="Segoe UI Symbol"/>
+              </w:rPr>
+              <w:t>➢</w:t>
+            </w:r>
+            <w:r>
+              <w:t xml:space="preserve"> Migration de Sage Batigest et de sa base SQL Server Express vers un nouveau serveur Windows, rétablissement des accès multi-postes.</w:t>
+            </w:r>
+            <w:r>
+              <w:br/>
+            </w:r>
+            <w:r>
+              <w:rPr>
+                <w:rFonts w:ascii="Segoe UI Symbol" w:hAnsi="Segoe UI Symbol" w:cs="Segoe UI Symbol"/>
+              </w:rPr>
+              <w:t>➢</w:t>
+            </w:r>
+            <w:r>
+              <w:t xml:space="preserve"> Configuration de SQL Server, des services réseau et des règles de pare-feu nécessaires au fonctionnement de Batigest.</w:t>
+            </w:r>
+            <w:r>
+              <w:br/>
+            </w:r>
+            <w:r>
+              <w:rPr>
+                <w:rFonts w:ascii="Segoe UI Symbol" w:hAnsi="Segoe UI Symbol" w:cs="Segoe UI Symbol"/>
+              </w:rPr>
+              <w:t>➢</w:t>
+            </w:r>
+            <w:r>
+              <w:t xml:space="preserve"> Administration distante sécurisée via Tailscale (WireGuard) et RDP, sans exposition du service RDP sur Internet, avec compte administrateur dédié et gestion des accès.</w:t>
+            </w:r>
+            <w:r>
+              <w:br/>
+            </w:r>
+            <w:r>
+              <w:rPr>
+                <w:rFonts w:ascii="Segoe UI Symbol" w:hAnsi="Segoe UI Symbol" w:cs="Segoe UI Symbol"/>
+              </w:rPr>
+              <w:t>➢</w:t>
+            </w:r>
+            <w:r>
+              <w:t xml:space="preserve"> Déploiement de RustDesk avec accès sans surveillance pour la télémaintenance et le support utilisateur.</w:t>
+            </w:r>
+            <w:r>
+              <w:br/>
+            </w:r>
+            <w:r>
+              <w:rPr>
+                <w:rFonts w:ascii="Segoe UI Symbol" w:hAnsi="Segoe UI Symbol" w:cs="Segoe UI Symbol"/>
+              </w:rPr>
+              <w:t>➢</w:t>
+            </w:r>
+            <w:r>
+              <w:rPr>
+                <w:b/>
+                <w:bCs/>
+              </w:rPr>
+              <w:t xml:space="preserve"> Fiabilisation du serveur</w:t>
+            </w:r>
+            <w:r>
+              <w:t xml:space="preserve"> : démarrage automatique des services, gestion de l'alimentation, accès réseau et continuité de service.</w:t>
+            </w:r>
+          </w:p>
+          <w:p>
+            <w:r>
+              <w:rPr>
+                <w:rFonts w:ascii="Segoe UI Symbol" w:hAnsi="Segoe UI Symbol" w:cs="Segoe UI Symbol"/>
+              </w:rPr>
+              <w:t>➢</w:t>
+            </w:r>
+            <w:r>
+              <w:rPr>
+                <w:b/>
+                <w:bCs/>
+              </w:rPr>
+              <w:t xml:space="preserve"> Environnement technique :</w:t>
+            </w:r>
+            <w:r>
+              <w:t xml:space="preserve"> Windows Server, administration système, PowerShell, Sage Batigest, SQL Server Express, Tailscale (WireGuard), RDP, SMB, TCP/IP, pare-feu Windows, RustDesk.</w:t>
+            </w:r>
+          </w:p>
+          <w:p/>
+          <w:p>
+            <w:pPr>
+              <w:keepNext/>
+            </w:pPr>
+            <w:r>
+              <w:rPr>
+                <w:b/>
+                <w:bCs/>
+                <w:sz w:val="22"/>
+                <w:szCs w:val="22"/>
+              </w:rPr>
+              <w:t xml:space="preserve">6. </w:t>
             </w:r>
             <w:r>
               <w:rPr>
@@ -3270,7 +3482,7 @@
                 <w:szCs w:val="20"/>
                 <w:lang w:eastAsia="fr-FR"/>
               </w:rPr>
-              <w:t xml:space="preserve">Conception de DREVIO, une plateforme SaaS destinée à digitaliser et automatiser l’évaluation des dommages automobiles : création d'un dossier à partir d'un véhicule et de photographies, analyse des dommages par intelligence artificielle, puis génération d'une première estimation exploitable par les professionnels de la carrosserie. Phase 1 terminée en août 2026, application mobile en cours. Une phase 2 démarre en novembre 2026.</w:t>
+              <w:t xml:space="preserve">Conception de DREVIO, une plateforme SaaS destinée à digitaliser et automatiser l’évaluation des dommages automobiles : création d'un dossier à partir d'un véhicule et de photographies, analyse des dommages par intelligence artificielle, puis génération d'une première estimation exploitable par les professionnels de la carrosserie. Phase 1 terminée en août 2026, application mobile en cours. Phase 2 amorcée en septembre 2026 avec HellBoy (dataset d'entraînement), lancement complet en novembre 2026.</w:t>
             </w:r>
           </w:p>
           <w:p/>
@@ -3311,7 +3523,7 @@
                 <w:sz w:val="22"/>
                 <w:szCs w:val="22"/>
               </w:rPr>
-              <w:t xml:space="preserve">DREVIO Mobile - Tech Lead de l'application iOS / Android</w:t>
+              <w:t xml:space="preserve">DREVIO Phase 2 - HellBoy, plateforme de constitution du dataset d'entraînement</w:t>
             </w:r>
             <w:r>
               <w:rPr>
@@ -3319,7 +3531,7 @@
                 <w:sz w:val="22"/>
                 <w:szCs w:val="22"/>
               </w:rPr>
-              <w:t xml:space="preserve"> (06/2026 à aujourd'hui) :</w:t>
+              <w:t xml:space="preserve"> (09/2026 à aujourd'hui) :</w:t>
             </w:r>
           </w:p>
           <w:p>
@@ -3343,7 +3555,7 @@
                 <w:szCs w:val="20"/>
                 <w:lang w:eastAsia="fr-FR"/>
               </w:rPr>
-              <w:t xml:space="preserve">Application mobile qui estime les dommages d'un véhicule à partir de photos analysées par IA : elle produit un rapport d'expertise, calcule un devis pour chaque garage partenaire et gère le paiement en ligne.</w:t>
+              <w:t xml:space="preserve">Pour entraîner demain un modèle de reconnaissance des dégâts de carrosserie et d'estimation du coût de réparation, DREVIO a besoin de photos adossées au prix réellement facturé. HellBoy fabrique cette matière première : chaque dossier validé (photos, dégâts localisés, prix facturé) devient un échantillon d'entraînement.</w:t>
             </w:r>
           </w:p>
           <w:p>
@@ -3354,14 +3566,7 @@
               <w:t>➢</w:t>
             </w:r>
             <w:r>
-              <w:rPr>
-                <w:b/>
-                <w:bCs/>
-              </w:rPr>
-              <w:t xml:space="preserve"> Mise en place du projet</w:t>
-            </w:r>
-            <w:r>
-              <w:t xml:space="preserve"> : initialisation de l'application, environnements de développement et de production, choix de la stack et de l'architecture par fonctionnalité (auth, scan, véhicule, paiement, notifications).</w:t>
+              <w:t xml:space="preserve"> Import des archives transmises par les carrossiers (ZIP : photos et estimation de travaux en PDF) : lecture du véhicule, des taux horaires, des pièces et des opérations, avec contrôle que le total reconstitué retombe au centime sur le total HT imprimé.</w:t>
             </w:r>
             <w:r>
               <w:br/>
@@ -3373,14 +3578,7 @@
               <w:t>➢</w:t>
             </w:r>
             <w:r>
-              <w:rPr>
-                <w:b/>
-                <w:bCs/>
-              </w:rPr>
-              <w:t xml:space="preserve"> Pilotage d'un développeur</w:t>
-            </w:r>
-            <w:r>
-              <w:t xml:space="preserve"> : découpage du produit en plus de 60 lots livrables, rédaction et priorisation des tâches, suivi de leur réalisation.</w:t>
+              <w:t xml:space="preserve"> Vocabulaire fermé (32 zones de carrosserie, 13 natures de dégât, 3 gravités) dans un paquet de domaine partagé par l'API et le dashboard, imposé en base par clés étrangères.</w:t>
             </w:r>
             <w:r>
               <w:br/>
@@ -3396,10 +3594,10 @@
                 <w:b/>
                 <w:bCs/>
               </w:rPr>
-              <w:t xml:space="preserve"> Qualité et revue de code</w:t>
-            </w:r>
-            <w:r>
-              <w:t xml:space="preserve"> : relecture de plus de 140 pull requests, durcissements après revue, contrôles TypeScript et lint.</w:t>
+              <w:t xml:space="preserve"> Atelier photos et annotation</w:t>
+            </w:r>
+            <w:r>
+              <w:t xml:space="preserve"> : saisie des dégâts directement sur la photo, boîtes englobantes normalisées dans le repère du fichier, déplacement et redimensionnement des zones.</w:t>
             </w:r>
             <w:r>
               <w:br/>
@@ -3411,14 +3609,7 @@
               <w:t>➢</w:t>
             </w:r>
             <w:r>
-              <w:rPr>
-                <w:b/>
-                <w:bCs/>
-              </w:rPr>
-              <w:t xml:space="preserve"> Logique métier</w:t>
-            </w:r>
-            <w:r>
-              <w:t xml:space="preserve"> : conception du calcul du prix par garage, qui applique à chaque garage ses propres tarifs et son mode de tarification.</w:t>
+              <w:t xml:space="preserve"> Circuit de relecture (brouillon, à relire, validé ou écarté), dossiers validés figés, droits par rôle (admin, relecteur, annotateur, lecteur) appliqués par l'API.</w:t>
             </w:r>
             <w:r>
               <w:br/>
@@ -3430,7 +3621,7 @@
               <w:t>➢</w:t>
             </w:r>
             <w:r>
-              <w:t xml:space="preserve"> Montée de version de l'application du SDK Expo 54 vers le SDK 57.</w:t>
+              <w:t xml:space="preserve"> Reprise en lecture seule des dossiers DREVIO dont l'expertise humaine est validée : seul le chiffrage humain est repris, pour ne pas apprendre au modèle à imiter l'IA actuelle.</w:t>
             </w:r>
             <w:r>
               <w:br/>
@@ -3442,55 +3633,29 @@
               <w:t>➢</w:t>
             </w:r>
             <w:r>
-              <w:t xml:space="preserve"> Fonctionnalités livrées sous ma direction :</w:t>
-            </w:r>
-          </w:p>
-          <w:p>
-            <w:pPr>
-              <w:ind w:left="720"/>
-            </w:pPr>
-            <w:r>
-              <w:t xml:space="preserve">- Scan guidé à la caméra avec contrôle qualité des photos et suivi de l'analyse IA en temps réel.</w:t>
+              <w:t xml:space="preserve"> Export versionné du dataset (dossiers validés uniquement, montants en centimes entiers, contexte de prix).</w:t>
             </w:r>
             <w:r>
               <w:br/>
             </w:r>
             <w:r>
-              <w:t xml:space="preserve">- Rapport IA avec localisation des dommages, relance de l'analyse et demande d'expertise humaine.</w:t>
-            </w:r>
-            <w:r>
-              <w:br/>
-            </w:r>
-            <w:r>
-              <w:t xml:space="preserve">- Recherche de garages par géolocalisation, avec tri et filtres.</w:t>
-            </w:r>
-            <w:r>
-              <w:br/>
-            </w:r>
-            <w:r>
-              <w:t xml:space="preserve">- Paiement Stripe (acompte, solde, remboursement) via les Edge Functions Supabase.</w:t>
-            </w:r>
-            <w:r>
-              <w:br/>
-            </w:r>
-            <w:r>
-              <w:t xml:space="preserve">- Parcours assurance et sinistre, gestion des véhicules en LLD / LOA.</w:t>
-            </w:r>
-            <w:r>
-              <w:br/>
-            </w:r>
-            <w:r>
-              <w:t xml:space="preserve">- Notifications push (Firebase), connexion Google OAuth et mises à jour OTA.</w:t>
-            </w:r>
-          </w:p>
-          <w:p>
-            <w:r>
               <w:rPr>
                 <w:rFonts w:ascii="Segoe UI Symbol" w:hAnsi="Segoe UI Symbol" w:cs="Segoe UI Symbol"/>
               </w:rPr>
               <w:t>➢</w:t>
             </w:r>
             <w:r>
+              <w:t xml:space="preserve"> Déploiement Docker sur le VPS de DREVIO derrière Traefik, avec sa propre base et son propre sous-domaine.</w:t>
+            </w:r>
+          </w:p>
+          <w:p>
+            <w:r>
+              <w:rPr>
+                <w:rFonts w:ascii="Segoe UI Symbol" w:hAnsi="Segoe UI Symbol" w:cs="Segoe UI Symbol"/>
+              </w:rPr>
+              <w:t>➢</w:t>
+            </w:r>
+            <w:r>
               <w:rPr>
                 <w:b/>
                 <w:bCs/>
@@ -3498,7 +3663,7 @@
               <w:t xml:space="preserve"> Environnement technique :</w:t>
             </w:r>
             <w:r>
-              <w:t xml:space="preserve"> React Native 0.86, Expo SDK 57 (Expo Router), TypeScript, Zustand, TanStack Query, React Hook Form + Zod, Supabase (Edge Functions), Stripe, Firebase FCM.</w:t>
+              <w:t xml:space="preserve"> TypeScript, Node.js, Fastify (monorepo npm workspaces), React 19, Vite, TanStack Query, Zustand, PostgreSQL, Docker, Traefik, GitHub Actions.</w:t>
             </w:r>
           </w:p>
           <w:p/>
@@ -3514,6 +3679,218 @@
                 <w:szCs w:val="22"/>
               </w:rPr>
               <w:t xml:space="preserve">2. </w:t>
+            </w:r>
+            <w:r>
+              <w:rPr>
+                <w:b/>
+                <w:bCs/>
+                <w:color w:val="000000"/>
+                <w:sz w:val="22"/>
+                <w:szCs w:val="22"/>
+              </w:rPr>
+              <w:t xml:space="preserve">DREVIO Mobile - Tech Lead de l'application iOS / Android</w:t>
+            </w:r>
+            <w:r>
+              <w:rPr>
+                <w:color w:val="000000"/>
+                <w:sz w:val="22"/>
+                <w:szCs w:val="22"/>
+              </w:rPr>
+              <w:t xml:space="preserve"> (06/2026 à aujourd'hui) :</w:t>
+            </w:r>
+          </w:p>
+          <w:p>
+            <w:pPr>
+              <w:pStyle w:val="Corpsdetexte"/>
+              <w:rPr>
+                <w:i/>
+                <w:iCs/>
+                <w:color w:val="auto"/>
+                <w:sz w:val="20"/>
+                <w:szCs w:val="20"/>
+                <w:lang w:eastAsia="fr-FR"/>
+              </w:rPr>
+            </w:pPr>
+            <w:r>
+              <w:rPr>
+                <w:i/>
+                <w:iCs/>
+                <w:color w:val="auto"/>
+                <w:sz w:val="20"/>
+                <w:szCs w:val="20"/>
+                <w:lang w:eastAsia="fr-FR"/>
+              </w:rPr>
+              <w:t xml:space="preserve">Application mobile qui estime les dommages d'un véhicule à partir de photos analysées par IA : elle produit un rapport d'expertise, calcule un devis pour chaque garage partenaire et gère le paiement en ligne.</w:t>
+            </w:r>
+          </w:p>
+          <w:p>
+            <w:r>
+              <w:rPr>
+                <w:rFonts w:ascii="Segoe UI Symbol" w:hAnsi="Segoe UI Symbol" w:cs="Segoe UI Symbol"/>
+              </w:rPr>
+              <w:t>➢</w:t>
+            </w:r>
+            <w:r>
+              <w:rPr>
+                <w:b/>
+                <w:bCs/>
+              </w:rPr>
+              <w:t xml:space="preserve"> Mise en place du projet</w:t>
+            </w:r>
+            <w:r>
+              <w:t xml:space="preserve"> : initialisation de l'application, environnements de développement et de production, choix de la stack et de l'architecture par fonctionnalité (auth, scan, véhicule, paiement, notifications).</w:t>
+            </w:r>
+            <w:r>
+              <w:br/>
+            </w:r>
+            <w:r>
+              <w:rPr>
+                <w:rFonts w:ascii="Segoe UI Symbol" w:hAnsi="Segoe UI Symbol" w:cs="Segoe UI Symbol"/>
+              </w:rPr>
+              <w:t>➢</w:t>
+            </w:r>
+            <w:r>
+              <w:rPr>
+                <w:b/>
+                <w:bCs/>
+              </w:rPr>
+              <w:t xml:space="preserve"> Pilotage d'un développeur</w:t>
+            </w:r>
+            <w:r>
+              <w:t xml:space="preserve"> : découpage du produit en plus de 60 lots livrables, rédaction et priorisation des tâches, suivi de leur réalisation.</w:t>
+            </w:r>
+            <w:r>
+              <w:br/>
+            </w:r>
+            <w:r>
+              <w:rPr>
+                <w:rFonts w:ascii="Segoe UI Symbol" w:hAnsi="Segoe UI Symbol" w:cs="Segoe UI Symbol"/>
+              </w:rPr>
+              <w:t>➢</w:t>
+            </w:r>
+            <w:r>
+              <w:rPr>
+                <w:b/>
+                <w:bCs/>
+              </w:rPr>
+              <w:t xml:space="preserve"> Qualité et revue de code</w:t>
+            </w:r>
+            <w:r>
+              <w:t xml:space="preserve"> : relecture de plus de 140 pull requests, durcissements après revue, contrôles TypeScript et lint.</w:t>
+            </w:r>
+            <w:r>
+              <w:br/>
+            </w:r>
+            <w:r>
+              <w:rPr>
+                <w:rFonts w:ascii="Segoe UI Symbol" w:hAnsi="Segoe UI Symbol" w:cs="Segoe UI Symbol"/>
+              </w:rPr>
+              <w:t>➢</w:t>
+            </w:r>
+            <w:r>
+              <w:rPr>
+                <w:b/>
+                <w:bCs/>
+              </w:rPr>
+              <w:t xml:space="preserve"> Logique métier</w:t>
+            </w:r>
+            <w:r>
+              <w:t xml:space="preserve"> : conception du calcul du prix par garage, qui applique à chaque garage ses propres tarifs et son mode de tarification.</w:t>
+            </w:r>
+            <w:r>
+              <w:br/>
+            </w:r>
+            <w:r>
+              <w:rPr>
+                <w:rFonts w:ascii="Segoe UI Symbol" w:hAnsi="Segoe UI Symbol" w:cs="Segoe UI Symbol"/>
+              </w:rPr>
+              <w:t>➢</w:t>
+            </w:r>
+            <w:r>
+              <w:t xml:space="preserve"> Montée de version de l'application du SDK Expo 54 vers le SDK 57.</w:t>
+            </w:r>
+            <w:r>
+              <w:br/>
+            </w:r>
+            <w:r>
+              <w:rPr>
+                <w:rFonts w:ascii="Segoe UI Symbol" w:hAnsi="Segoe UI Symbol" w:cs="Segoe UI Symbol"/>
+              </w:rPr>
+              <w:t>➢</w:t>
+            </w:r>
+            <w:r>
+              <w:t xml:space="preserve"> Fonctionnalités livrées sous ma direction :</w:t>
+            </w:r>
+          </w:p>
+          <w:p>
+            <w:pPr>
+              <w:ind w:left="720"/>
+            </w:pPr>
+            <w:r>
+              <w:t xml:space="preserve">- Scan guidé à la caméra avec contrôle qualité des photos et suivi de l'analyse IA en temps réel.</w:t>
+            </w:r>
+            <w:r>
+              <w:br/>
+            </w:r>
+            <w:r>
+              <w:t xml:space="preserve">- Rapport IA avec localisation des dommages, relance de l'analyse et demande d'expertise humaine.</w:t>
+            </w:r>
+            <w:r>
+              <w:br/>
+            </w:r>
+            <w:r>
+              <w:t xml:space="preserve">- Recherche de garages par géolocalisation, avec tri et filtres.</w:t>
+            </w:r>
+            <w:r>
+              <w:br/>
+            </w:r>
+            <w:r>
+              <w:t xml:space="preserve">- Paiement Stripe (acompte, solde, remboursement) via les Edge Functions Supabase.</w:t>
+            </w:r>
+            <w:r>
+              <w:br/>
+            </w:r>
+            <w:r>
+              <w:t xml:space="preserve">- Parcours assurance et sinistre, gestion des véhicules en LLD / LOA.</w:t>
+            </w:r>
+            <w:r>
+              <w:br/>
+            </w:r>
+            <w:r>
+              <w:t xml:space="preserve">- Notifications push (Firebase), connexion Google OAuth et mises à jour OTA.</w:t>
+            </w:r>
+          </w:p>
+          <w:p>
+            <w:r>
+              <w:rPr>
+                <w:rFonts w:ascii="Segoe UI Symbol" w:hAnsi="Segoe UI Symbol" w:cs="Segoe UI Symbol"/>
+              </w:rPr>
+              <w:t>➢</w:t>
+            </w:r>
+            <w:r>
+              <w:rPr>
+                <w:b/>
+                <w:bCs/>
+              </w:rPr>
+              <w:t xml:space="preserve"> Environnement technique :</w:t>
+            </w:r>
+            <w:r>
+              <w:t xml:space="preserve"> React Native 0.86, Expo SDK 57 (Expo Router), TypeScript, Zustand, TanStack Query, React Hook Form + Zod, Supabase (Edge Functions), Stripe, Firebase FCM.</w:t>
+            </w:r>
+          </w:p>
+          <w:p/>
+          <w:p>
+            <w:pPr>
+              <w:keepNext/>
+            </w:pPr>
+            <w:r>
+              <w:rPr>
+                <w:b/>
+                <w:bCs/>
+                <w:sz w:val="22"/>
+                <w:szCs w:val="22"/>
+              </w:rPr>
+              <w:t xml:space="preserve">3. </w:t>
             </w:r>
             <w:r>
               <w:rPr>

</xml_diff>